<commit_message>
modifie readme et code
</commit_message>
<xml_diff>
--- a/Claude outputs/ArticleN1_PhD_MPVICON.docx
+++ b/Claude outputs/ArticleN1_PhD_MPVICON.docx
@@ -20,12 +20,12 @@
     </w:p>
     <w:p>
       <w:r>
-        <w:t xml:space="preserve">Pour le QoM du poignet (n = 120), MediaPipe a montré une forte association linéaire avec Vicon (r = ,93 ; R² = ,86), confirmée par un test de permutation contraint par dyade comme reflétant une correspondance individuelle réelle plutôt qu'un artefact de contexte partagé (p &lt; ,001), ainsi qu'un bon accord absolu (ICC(2,1) = ,86 ; RMSE = 38,4 ; biais = +24,0, exprimés en unités normalisées par la largeur des épaules) ; l'analyse de Bland-Altman a indiqué un biais proportionnel plutôt que constant. Le QoM de la tête a montré une corrélation tout aussi forte (r = ,89 ; R² = ,80) et un accord absolu tout aussi bon (ICC(2,1) = ,89 ; RMSE = 4,7 ; biais = −1,3), sans biais proportionnel significatif. Au niveau local, le suivi de l'angle articulaire du coude a montré une validité modérée à bonne face à l'angle Vicon 3D brut non projeté (r = ,69) ainsi que dans deux des trois plans de projection (XZ : r = ,68 ; YZ : r = ,66), mais restait faible dans le plan horizontal-vertical (XY : r = ,12). L'amplitude crête-à-crête du poignet a montré un accord plus inégal selon le plan de projection retenu (ICC(2,1) = ,14–,40 ; intervalles de confiance à 95 % incluant des valeurs proches de zéro sur les trois plans).</w:t>
-      </w:r>
-    </w:p>
-    <w:p>
-      <w:r>
-        <w:t xml:space="preserve">Ces résultats montrent une validité de MediaPipe globalement bonne, mais sensible à des choix de définition métrique et de plan de comparaison en apparence mineurs. La dynamique globale du mouvement (QoM) a été bien estimée pour le poignet comme pour la tête dès lors que les deux systèmes étaient comparés selon des définitions strictement équivalentes ; le biais proportionnel résiduel pour le poignet reste cohérent avec une accumulation de bruit de suivi dans un indice cumulatif plutôt qu'avec une limite intrinsèque du suivi sans marqueurs. Au niveau local, l'angle du coude a montré un accord raisonnable dans la plupart des plans, sauf le plus éloigné de l'axe de vue de la caméra (XY), tandis que l'amplitude du poignet, plus sensible aux valeurs extrêmes qu'une mesure cumulative, est restée plus inégale selon le plan considéré. MediaPipe apparaît donc adapté aux études écologiques de la dynamique globale du mouvement en contexte conversationnel spontané et, sous réserve d'un plan de comparaison proche de l'axe de vue effectif de la caméra, à une analyse articulaire plus fine ; sa pertinence pour l'étude de la coordination interpersonnelle proprement dite resterait à démontrer directement.</w:t>
+        <w:t xml:space="preserve">Pour le QoM du poignet (n = 120), MediaPipe a montré une forte association linéaire avec Vicon (r = ,93 ; R² = ,86), confirmée par un test de permutation contraint par dyade comme reflétant une correspondance individuelle réelle plutôt qu'un artefact de contexte partagé (p &lt; ,001), ainsi qu'un bon accord absolu (ICC(2,1) = ,86 ; RMSE = 38,4 ; biais = +24,0, exprimés en unités normalisées par la largeur des épaules) ; l'analyse de Bland-Altman a indiqué un biais proportionnel plutôt que constant. Le QoM de la tête a montré une corrélation tout aussi forte (r = ,89 ; R² = ,80) et un accord absolu tout aussi bon (ICC(2,1) = ,89 ; RMSE = 4,7 ; biais = −1,3), sans biais proportionnel significatif. Au niveau local, l'angle articulaire du coude a montré une bonne association temporelle avec Vicon (VI3 : r = ,81 ; XZ : r = ,80 ; YZ : r = ,77), sans que l'exactitude angulaire absolue ne suive : la RMSE correspondante reste substantielle (30° à 37°) même dans ces référentiels, et l'association s'effondre dans le plan horizontal-vertical (XY : r = ,14). L'amplitude crête-à-crête du poignet a montré un accord plus inégal selon le plan de projection retenu (ICC(2,1) = ,14–,40 ; intervalles de confiance à 95 % incluant des valeurs proches de zéro sur les trois plans).</w:t>
+      </w:r>
+    </w:p>
+    <w:p>
+      <w:r>
+        <w:t xml:space="preserve">Ces résultats montrent une validité de MediaPipe globalement bonne, mais sensible à des choix de définition métrique et de plan de comparaison en apparence mineurs. La dynamique globale du mouvement (QoM) a été bien estimée pour le poignet comme pour la tête dès lors que les deux systèmes étaient comparés selon des définitions strictement équivalentes ; le biais proportionnel résiduel pour le poignet reste cohérent avec une accumulation de bruit de suivi dans un indice cumulatif plutôt qu'avec une limite intrinsèque du suivi sans marqueurs. Au niveau local, MediaPipe reproduit bien la dynamique temporelle de l'angle du coude dans la plupart des plans, sans en restituer fidèlement la valeur absolue, et l'association elle-même s'effondre dans le plan le plus éloigné de l'axe de vue de la caméra (XY) ; l'amplitude du poignet, plus sensible aux valeurs extrêmes qu'une mesure cumulative, est restée plus inégale selon le plan considéré. MediaPipe apparaît donc adapté aux études écologiques de la dynamique globale du mouvement en contexte conversationnel spontané, ainsi qu'au suivi temporel d'un geste articulaire sous réserve d'un plan de comparaison adapté — mais pas, en l'état, à une mesure précise de l'angle absolu ; sa pertinence pour l'étude de la coordination interpersonnelle proprement dite resterait à démontrer directement.</w:t>
       </w:r>
     </w:p>
     <w:p>
@@ -125,7 +125,7 @@
         <w:br/>
         <w:t xml:space="preserve">L'angle articulaire continu du coude a été calculé au niveau de l'articulation du coude à partir des repères adjacents de l'épaule et du poignet. Pour MediaPipe, intrinsèquement </w:t>
         <w:lastRenderedPageBreak/>
-        <w:t xml:space="preserve">bidimensionnel, les coordonnées 2D ont d'abord été projetées dans un repère local centré sur les épaules, dans lequel l'axe horizontal est le vecteur unitaire allant de l'épaule gauche à l'épaule droite, et l'axe vertical en est le vecteur orthogonal. Deux références complémentaires ont été calculées du côté Vicon : un angle 3D brut, non projeté (VI3), et, en parallèle, les trois mêmes plans de projection anatomiques que pour l'amplitude du poignet (VI2 : XY, XZ, YZ), chacun exprimé dans le même repère local 2D centré sur les épaules que l'angle MediaPipe. Pour les deux systèmes, l'angle du coude a été calculé comme l'arccosinus du produit scalaire normalisé entre le vecteur du bras (coude vers épaule) et le vecteur de l'avant-bras (coude vers poignet), converti en degrés. Les séries continues de l'angle du coude ont été extraites indépendamment pour les côtés gauche et droit, pour MediaPipe comme pour chaque référence Vicon (VI2 par plan, et VI3).</w:t>
+        <w:t xml:space="preserve">bidimensionnel, les coordonnées 2D ont d'abord été projetées dans un repère local centré sur les épaules, dans lequel l'axe horizontal est le vecteur unitaire allant de l'épaule gauche à l'épaule droite, et l'axe vertical en est le vecteur orthogonal. Deux références complémentaires ont été calculées du côté Vicon : un angle 3D brut, non projeté (VI3), et, en parallèle, les trois mêmes plans de projection anatomiques que pour l'amplitude du poignet (VI2 : XY, XZ, YZ), chacun exprimé dans le même repère local 2D centré sur les épaules que l'angle MediaPipe. Pour les deux systèmes, l'angle du coude a été calculé comme l'arccosinus du produit scalaire normalisé entre le vecteur du bras (coude vers épaule) et le vecteur de l'avant-bras (coude vers poignet), converti en degrés. Les séries continues de l'angle du coude ont été extraites indépendamment pour les côtés gauche et droit, pour MediaPipe comme pour chaque référence Vicon (VI2 par plan, et VI3). Pour chaque référence, les corrélations de Pearson obtenues séparément pour les 120 enregistrements et les deux côtés ont été moyennées par transformation z de Fisher (moyenne des z, puis rétro-transformation en r), plus appropriée que la moyenne arithmétique pour agréger des coefficients de corrélation (Tableau 4).</w:t>
       </w:r>
     </w:p>
     <w:p>
@@ -145,7 +145,7 @@
         <w:br/>
         <w:t xml:space="preserve">Au niveau local, la validité du suivi concomitant des séries temporelles continues de l'angle du coude a été évaluée. Pour chaque enregistrement (un participant dans une condition posturale) et pour chaque côté (gauche, droit), un coefficient de corrélation de Pearson (r) et une RMSE ont été calculés directement entre les séries temporelles synchronisées MediaPipe et Vicon, séparément pour l'angle Vicon 3D brut non projeté (VI3) et pour chacun des trois plans de projection Vicon (VI2 : XY, XZ, YZ). Ces métriques par enregistrement et par côté ont ensuite été moyennées bilatéralement puis résumées sur l'ensemble de l'échantillon (n = 120 enregistrements par plan) au moyen de statistiques descriptives (moyenne et écart-type de r et de la RMSE), afin de refléter la précision du suivi continu en conditions interactionnelles non contraintes.</w:t>
         <w:br/>
-        <w:t xml:space="preserve">Afin de s'assurer que les corrélations globales observées n'étaient pas uniquement portées par des effets dyadiques ou contextuels, un test de permutation contraint a été réalisé sur les indices globaux poolés (MQI du poignet et de la tête). Au sein de chaque paire dyade-condition, les étiquettes de participant (P1/P2) du côté Vicon ont été permutées aléatoirement (5 000 permutations, graine aléatoire fixe), ce qui rompait la correspondance au niveau du participant entre les mesures MediaPipe et Vicon tout en préservant la structure dyadique et posturale des données. La corrélation observée a ensuite été comparée à la distribution nulle ainsi obtenue afin de dériver une valeur p empirique. Comme vérification de robustesse, la même procédure de permutation a été répétée séparément au sein de chacune des trois conditions posturales (n = 40 participants strictement indépendants par condition). Pour tenir compte de la non-indépendance des observations au sein d'une même dyade (deux participants, trois conditions posturales), les intervalles de confiance de r et de l'ICC(2,1) ont également été recalculés par un bootstrap par grappe au niveau de la dyade (rééchantillonnage avec remise des 20 dyades, en conservant les observations de chaque dyade tirée, 5 000 réplications), en complément des intervalles de confiance analytiques classiques rapportés dans les Tableaux 1, 3 et 4.</w:t>
+        <w:t xml:space="preserve">Afin de s'assurer que les corrélations globales observées n'étaient pas uniquement portées par des effets dyadiques ou contextuels, un test de permutation contraint a été réalisé sur les indices globaux poolés (MQI du poignet et de la tête). Au sein de chaque paire dyade-condition, les étiquettes de participant (P1/P2) du côté Vicon ont été permutées aléatoirement (5 000 permutations, graine aléatoire fixe), ce qui rompait la correspondance au niveau du participant entre les mesures MediaPipe et Vicon tout en préservant la structure dyadique et posturale des données. La corrélation observée a ensuite été comparée à la distribution nulle ainsi obtenue afin de dériver une valeur p empirique. Comme vérification de robustesse, la même procédure de permutation a été répétée séparément au sein de chacune des trois conditions posturales (n = 40 participants, soit 20 dyades, par condition — ces observations demeurant non indépendantes au sein de chaque dyade). Pour tenir compte de la non-indépendance des observations au sein d'une même dyade (deux participants, trois conditions posturales), les intervalles de confiance de r et de l'ICC(2,1) ont également été recalculés par un bootstrap par grappe au niveau de la dyade (rééchantillonnage avec remise des 20 dyades, en conservant les observations de chaque dyade tirée, 5 000 réplications), en complément des intervalles de confiance analytiques classiques rapportés dans les Tableaux 1, 3 et 4.</w:t>
       </w:r>
     </w:p>
     <w:p>
@@ -1187,7 +1187,7 @@
         <w:spacing w:after="200"/>
       </w:pPr>
       <w:r>
-        <w:t xml:space="preserve">Pour vérifier que les corrélations globales (n = 120, conditions poolées) ne masquent pas une hétérogénéité entre conditions posturales, le test de permutation a été répété séparément dans chacune des trois conditions (n = 40 participants strictement indépendants par condition). Les corrélations restent fortes et significatives dans les trois conditions, pour le poignet comme pour la tête (Tableau 2).</w:t>
+        <w:t xml:space="preserve">Pour vérifier que les corrélations globales (n = 120, conditions poolées) ne masquent pas une hétérogénéité entre conditions posturales, le test de permutation a été répété séparément dans chacune des trois conditions (n = 40 participants, soit 20 dyades, par condition). Les corrélations restent fortes et significatives dans les trois conditions, pour le poignet comme pour la tête (Tableau 2).</w:t>
       </w:r>
     </w:p>
     <w:p>
@@ -3586,7 +3586,7 @@
         <w:spacing w:after="200"/>
       </w:pPr>
       <w:r>
-        <w:t xml:space="preserve">Le suivi de l'angle du coude par MediaPipe s'est révélé modéré à bon dans deux des trois plans de projection considérés (XZ, YZ) ainsi que face à l'angle Vicon 3D brut, non projeté (VI3), mais nettement plus faible dans le troisième plan (XY).</w:t>
+        <w:t xml:space="preserve">L'association temporelle entre MediaPipe et Vicon pour l'angle du coude s'est révélée modérée à bonne dans deux des trois plans de projection considérés (XZ, YZ) ainsi que face à l'angle Vicon 3D brut, non projeté (VI3), mais nettement plus faible dans le troisième plan (XY). Cette association ne renseigne toutefois que sur la correspondance des variations dans le temps, non sur l'exactitude de la valeur angulaire elle-même (voir RMSE ci-dessous).</w:t>
       </w:r>
     </w:p>
     <w:p>
@@ -3594,7 +3594,7 @@
         <w:spacing w:after="200"/>
       </w:pPr>
       <w:r>
-        <w:t>Les corrélations moyennes (bilatérales, par participant-condition) atteignent r = ,69 pour la référence 3D non projetée (VI3), un niveau comparable à celui des deux meilleurs plans de projection (XZ : r = ,68 ; YZ : r = ,66), contre seulement r = ,12 dans le plan XY. Les RMSE correspondantes suivent le même classement (30,4° à 37,2° pour YZ, XZ et VI3, soit environ un cinquième à un quart de la plage de flexion typique du coude de 0 à 150° ; contre 71,8°, soit près de la moitié de cette plage, pour le plan XY ; Tableau 4).</w:t>
+        <w:t>Les corrélations moyennes (bilatérales, par participant-condition, moyennées par transformation z de Fisher — voir Méthode) atteignent r = ,81 pour la référence 3D non projetée (VI3), un niveau comparable à celui des deux meilleurs plans de projection (XZ : r = ,80 ; YZ : r = ,77), contre seulement r = ,14 dans le plan XY. Les RMSE correspondantes suivent le même classement, mais restent substantielles y compris dans les meilleurs référentiels (30,4° à 37,2° pour YZ, XZ et VI3, soit environ un cinquième à un quart de la plage de flexion typique du coude de 0 à 150° ; contre 71,8°, soit près de la moitié de cette plage, pour le plan XY ; Tableau 4) : une association temporelle forte n'implique donc pas une exactitude angulaire absolue comparable.</w:t>
       </w:r>
     </w:p>
     <w:p>
@@ -3870,7 +3870,7 @@
                 <w:sz w:val="18"/>
                 <w:szCs w:val="18"/>
               </w:rPr>
-              <w:t>,661 (,314)</w:t>
+              <w:t>,768 (,314)</w:t>
             </w:r>
           </w:p>
         </w:tc>
@@ -3995,7 +3995,7 @@
                 <w:sz w:val="18"/>
                 <w:szCs w:val="18"/>
               </w:rPr>
-              <w:t>,679 (,337)</w:t>
+              <w:t>,804 (,337)</w:t>
             </w:r>
           </w:p>
         </w:tc>
@@ -4120,7 +4120,7 @@
                 <w:sz w:val="18"/>
                 <w:szCs w:val="18"/>
               </w:rPr>
-              <w:t>,119 (,392)</w:t>
+              <w:t>,142 (,392)</w:t>
             </w:r>
           </w:p>
         </w:tc>
@@ -4245,7 +4245,7 @@
                 <w:sz w:val="18"/>
                 <w:szCs w:val="18"/>
               </w:rPr>
-              <w:t>,688 (,310)</w:t>
+              <w:t>,808 (,310)</w:t>
             </w:r>
           </w:p>
         </w:tc>
@@ -4292,7 +4292,7 @@
           <w:sz w:val="18"/>
           <w:szCs w:val="18"/>
         </w:rPr>
-        <w:t>Note. Moyennes bilatérales (côtés gauche et droit) des corrélations et RMSE calculées individuellement pour chaque enregistrement (un participant dans une condition posturale). IC95 % bootstrap par dyade pour r moyen (5 000 réplications) : YZ [,603 ; ,711] ; XZ [,630 ; ,729] ; XY [,043 ; ,189] ; 3D brut (VI3) [,648 ; ,727]</w:t>
+        <w:t>Note. Moyennes bilatérales (côtés gauche et droit) des corrélations et RMSE calculées individuellement pour chaque enregistrement (un participant dans une condition posturale). Les r moyens sont calculés par transformation z de Fisher (moyenne des z, puis rétro-transformation en r), plus appropriée que la moyenne arithmétique pour des coefficients de corrélation. IC95 % bootstrap par dyade pour r moyen, même procédure (5 000 réplications) : YZ [,722 ; ,803] ; XZ [,769 ; ,835] ; XY [,047 ; ,231] ; 3D brut (VI3) [,783 ; ,831]</w:t>
       </w:r>
     </w:p>
     <w:p>
@@ -4433,7 +4433,7 @@
           <w:sz w:val="20"/>
           <w:szCs w:val="20"/>
         </w:rPr>
-        <w:t xml:space="preserve">Figure 7. Angle du coude (bras droit) au cours du temps, MediaPipe vs Vicon (dyade D18, debout ; r = ,91 face à VI3, r = ,92 face au plan XZ pour cet enregistrement) : les deux systèmes suivent les mêmes montées et descentes une fois la correspondance temporelle établie à partir du fps réel.</w:t>
+        <w:t xml:space="preserve">Figure 7. Angle du coude (bras droit) au cours du temps, MediaPipe vs Vicon (dyade D12, debout ; r = ,84 face à VI3, r = ,88 face au plan XZ pour cet enregistrement, choisi pour sa proximité avec la médiane de l'échantillon plutôt que pour un accord exceptionnel) : les deux systèmes suivent des variations globalement similaires une fois la correspondance temporelle établie à partir du fps réel, mais avec un écart de niveau visible entre les deux courbes, illustrant concrètement la distinction entre association temporelle et exactitude angulaire absolue.</w:t>
       </w:r>
       <w:r>
         <w:rPr>
@@ -4493,7 +4493,7 @@
         <w:rPr>
           <w:rFonts w:ascii="Times New Roman" w:hAnsi="Times New Roman" w:cs="Times New Roman"/>
         </w:rPr>
-        <w:t xml:space="preserve">Pour le QoM du poignet, la forte corrélation (r = ,93) et le bon accord absolu (ICC = ,86) indiquent que MediaPipe capture à la fois le classement relatif des participants et l'ampleur réelle de leur mouvement de poignet. Le test de permutation contraint confirme que cet accord reflète une correspondance individuelle authentique et non un simple effet de contexte partagé entre les deux membres d'une dyade. Les intervalles de confiance obtenus par un bootstrap par dyade, qui tient compte de la structure non indépendante de ces observations, restent cohérents avec les estimations analytiques ci-dessus (voir Méthode et Tableau 1). Ce résultat doit néanmoins être nuancé par le biais proportionnel désormais confirmé statistiquement (pente = 0,218, p &lt; ,001), selon le cadre d'analyse classique de Bland et Altman (1999) pour l'évaluation de l'accord entre deux méthodes de mesure : l'écart entre les deux systèmes s'accroît avec l'amplitude du mouvement, MediaPipe surestimant davantage les mouvements les plus amples. Ce pattern est cohérent avec une accumulation de bruit de suivi dans une métrique cumulative comme le MQI, dans laquelle chaque micro-erreur de localisation d'image s'ajoute aux autres plutôt que de s'annuler.</w:t>
+        <w:t xml:space="preserve">Pour le QoM du poignet, la forte corrélation (r = ,93) et le bon accord absolu (ICC = ,86) indiquent que MediaPipe capture à la fois le classement relatif des participants et l'ampleur globale de leur mouvement de poignet. Le test de permutation contraint confirme que cet accord reflète une correspondance individuelle authentique et non un simple effet de contexte partagé entre les deux membres d'une dyade. Les intervalles de confiance obtenus par un bootstrap par dyade, qui tient compte de la structure non indépendante de ces observations, restent cohérents avec les estimations analytiques ci-dessus (voir Méthode et Tableau 1). Ce résultat doit néanmoins être nuancé par le biais proportionnel désormais confirmé statistiquement (pente = 0,218, p &lt; ,001), selon le cadre d'analyse classique de Bland et Altman (1999) pour l'évaluation de l'accord entre deux méthodes de mesure : l'écart entre les deux systèmes s'accroît avec l'amplitude du mouvement, MediaPipe surestimant davantage les mouvements les plus amples. Ce pattern est cohérent avec une accumulation de bruit de suivi dans une métrique cumulative comme le MQI, dans laquelle chaque micro-erreur de localisation d'image s'ajoute aux autres plutôt que de s'annuler.</w:t>
       </w:r>
     </w:p>
     <w:p>
@@ -4521,7 +4521,7 @@
         <w:rPr>
           <w:rFonts w:ascii="Times New Roman" w:hAnsi="Times New Roman" w:cs="Times New Roman"/>
         </w:rPr>
-        <w:t xml:space="preserve">L'amplitude crête-à-crête du poignet a montré un accord très inégal selon le plan de projection Vicon retenu (r = ,54 à ,74 ; ICC = ,13 à ,37), ce qui confirme la pertinence du traitement des trois plans comme analyse de sensibilité plutôt que comme un choix arbitraire a priori. Le biais est resté positif dans les trois plans, MediaPipe surestimant systématiquement l'amplitude par rapport à Vicon, avec des limites d'accord larges. Contrairement au QoM, qui somme un grand nombre de petits déplacements et bénéficie ainsi d'une forme de compensation statistique (les erreurs de suivi ponctuelles tendant à s'annuler plutôt qu'à s'accumuler dans un sens unique), l'amplitude crête-à-crête ne retient que deux valeurs extrêmes (minimum et maximum) sur toute la série : elle est donc beaucoup plus sensible à un unique pic de bruit ou à une erreur de suivi ponctuelle, ce qui peut expliquer à la fois la plus grande variabilité de l'accord et l'ampleur du biais observé.</w:t>
+        <w:t xml:space="preserve">L'amplitude crête-à-crête du poignet a montré un accord très inégal selon le plan de projection Vicon retenu (r = ,54 à ,74 ; ICC = ,13 à ,37), ce qui confirme la pertinence du traitement des trois plans comme analyse de sensibilité plutôt que comme un choix arbitraire a priori. Le biais est resté positif dans les trois plans, MediaPipe surestimant systématiquement l'amplitude par rapport à Vicon, avec des limites d'accord larges. Contrairement au QoM, qui somme un grand nombre de petits déplacements sur l'ensemble de l'enregistrement — de sorte qu'une erreur de suivi ponctuelle ne pèse que marginalement dans le total, même si un biais systématique peut s'y accumuler plutôt que s'y annuler, comme le suggère le biais proportionnel observé pour le poignet —, l'amplitude crête-à-crête ne retient que deux valeurs extrêmes (minimum et maximum) sur toute la série : elle est donc beaucoup plus sensible à un unique pic de bruit ou à une erreur de suivi ponctuelle, ce qui peut expliquer à la fois la plus grande variabilité de l'accord et l'ampleur du biais observé.</w:t>
       </w:r>
     </w:p>
     <w:p>
@@ -4535,7 +4535,7 @@
         <w:rPr>
           <w:rFonts w:ascii="Times New Roman" w:hAnsi="Times New Roman" w:cs="Times New Roman"/>
         </w:rPr>
-        <w:t xml:space="preserve">Un résultat notable concerne l'angle du coude : une fois la correspondance temporelle entre MediaPipe et Vicon établie à partir du fps réel de chaque enregistrement plutôt que d'une valeur nominale déclarée (voir Méthode), son suivi par MediaPipe s'est révélé modéré à bon face à l'angle Vicon 3D brut non projeté (VI3 : r = ,69) ainsi que dans deux des trois plans de projection (XZ : r = ,68 ; YZ : r = ,66), mais restait nettement plus faible dans le plan horizontal-vertical (XY : r = ,12). Puisque l'accord avec la référence 3D non projetée est du même ordre que celui obtenu avec les meilleurs plans de projection, l'explication ne réside pas dans le choix d'un plan de comparaison en particulier, mais plutôt dans l'alignement entre le plan XY et l'axe de vue effectif de la caméra : positionnée à un angle oblique pour préserver la visibilité mutuelle des interlocuteurs, celle-ci capture surtout les composantes de mouvement dans les plans XZ et YZ, ce qui pourrait expliquer pourquoi le plan XY, le plus orthogonal à cet axe, concentre l'essentiel du désaccord. Ce pattern, cohérent avec celui déjà observé pour l'amplitude du poignet (meilleur accord dans ce même plan XZ), suggère que la validité locale de MediaPipe dépend moins d'une limite générale du suivi monoculaire que de l'alignement entre le plan de comparaison retenu et la géométrie effective de la prise de vue. Il illustre aussi, comme pour le QoM de la tête, la sensibilité de ce type de comparaison à des choix méthodologiques a priori mineurs — ici, l'estimation du fps réel de chaque enregistrement plutôt que le recours à une valeur nominale déclarée.</w:t>
+        <w:t xml:space="preserve">Un résultat notable concerne l'angle du coude : une fois la correspondance temporelle entre MediaPipe et Vicon établie à partir du fps réel de chaque enregistrement plutôt que d'une valeur nominale déclarée (voir Méthode), l'association temporelle entre les deux systèmes s'est révélée modérée à bonne face à l'angle Vicon 3D brut non projeté (VI3 : r = ,81) ainsi que dans deux des trois plans de projection (XZ : r = ,80 ; YZ : r = ,77), mais restait nettement plus faible dans le plan horizontal-vertical (XY : r = ,14). Cette association ne doit pas être confondue avec un accord absolu sur la valeur de l'angle : même dans les référentiels les plus favorables, l'erreur reste substantielle (RMSE de 30° à 37°, soit près d'un quart de la plage de flexion typique du coude). MediaPipe reproduit donc raisonnablement bien la dynamique temporelle de l'angle du coude — ses hausses et ses baisses suivent celles de Vicon —, sans en restituer fidèlement la valeur absolue, y compris là où l'association est la plus forte. Puisque l'association avec la référence 3D non projetée est du même ordre que celle obtenue avec les meilleurs plans de projection, l'explication ne réside vraisemblablement pas dans le choix d'un plan de comparaison en particulier plutôt qu'un autre. Une explication plausible — compatible avec les données mais non démontrée géométriquement ici, faute d'une mesure précise de l'angle de la caméra — est que le plan XY se rapproche le plus de l'axe de vue effectif de la caméra, positionnée obliquement pour préserver la visibilité mutuelle des interlocuteurs, tandis que XZ et YZ capteraient davantage les composantes de mouvement réellement visibles par l'objectif. Ce pattern reste cohérent avec celui déjà observé pour l'amplitude du poignet (meilleur accord dans ce même plan XZ), et illustre, comme pour le QoM de la tête, la sensibilité de ce type de comparaison à des choix méthodologiques a priori mineurs — ici, l'estimation du fps réel plutôt que le recours à une valeur nominale déclarée.</w:t>
       </w:r>
     </w:p>
     <w:p>
@@ -4549,7 +4549,7 @@
         <w:rPr>
           <w:rFonts w:ascii="Times New Roman" w:hAnsi="Times New Roman" w:cs="Times New Roman"/>
         </w:rPr>
-        <w:t xml:space="preserve">Pris ensemble, ces résultats précisent les conditions d'utilisation de MediaPipe en recherche sur l'interaction sociale spontanée. En tant qu'outil de mesure de la dynamique globale du mouvement — quantité de mouvement du poignet et de la tête en particulier —, MediaPipe offre une alternative valide, accessible et peu coûteuse à la capture par marqueurs, ce qui ouvre la voie à des études écologiques à plus grande échelle sur le rôle du mouvement corporel dans la gestion des tours de parole, l'engagement mutuel ou la coordination interpersonnelle (Stivers et al., 2009 ; Mondada, 2016 ; Marsh et al., 2009 ; Ayache et al., 2021). D'autres travaux ont d'ailleurs déjà validé des approches de suivi vidéo comparables pour l'étude de la synchronie interpersonnelle en conversation, en montrant par exemple que l'analyse d'énergie de mouvement (Motion Energy Analysis) et un système de suivi de pose (OpenPose) convergent pour détecter des effets de genre et de personnalité sur la coordination dyadique (Fujiwara &amp; Yokomitsu, 2021) ; cela conforte l'idée qu'une métrique de quantité de mouvement globale, une fois sa validité concomitante établie comme nous le faisons ici, peut être directement exploitée pour étudier des construits interactionnels de ce type. En tant qu'outil de reconstruction fine de la cinématique articulaire, MediaPipe apparaît utilisable dans ce type de contexte à caméra unique et oblique, à condition de retenir un plan de comparaison proche de l'axe de vue effectif de la caméra, ou la référence 3D directement lorsqu'elle est disponible ; son usage pour des questions de recherche centrées sur la kinématique précise du geste (Kendon, 2004 ; Trujillo &amp; Holler, 2021) reste en revanche à valider plus directement dans le plan orthogonal à cet axe, où l'accord observé ici demeure faible.</w:t>
+        <w:t xml:space="preserve">Pris ensemble, ces résultats précisent les conditions d'utilisation de MediaPipe en recherche sur l'interaction sociale spontanée. En tant qu'outil de mesure de la dynamique globale du mouvement — quantité de mouvement du poignet et de la tête en particulier —, MediaPipe offre une alternative valide, accessible et peu coûteuse à la capture par marqueurs, ce qui ouvre la voie à des études écologiques à plus grande échelle sur le rôle du mouvement corporel dans la gestion des tours de parole, l'engagement mutuel ou la coordination interpersonnelle (Stivers et al., 2009 ; Mondada, 2016 ; Marsh et al., 2009 ; Ayache et al., 2021). D'autres travaux ont d'ailleurs déjà validé des approches de suivi vidéo comparables pour l'étude de la synchronie interpersonnelle en conversation, en montrant par exemple que l'analyse d'énergie de mouvement (Motion Energy Analysis) et un système de suivi de pose (OpenPose) convergent pour détecter des effets de genre et de personnalité sur la coordination dyadique (Fujiwara &amp; Yokomitsu, 2021) ; cela conforte l'idée qu'une métrique de quantité de mouvement globale, une fois sa validité concomitante établie comme nous le faisons ici, peut être directement exploitée pour étudier des construits interactionnels de ce type. Pour le suivi de la dynamique temporelle de l'angle articulaire, MediaPipe apparaît utilisable dans ce type de contexte à caméra unique et oblique, à condition de retenir un plan de comparaison proche de l'axe de vue effectif de la caméra, ou la référence 3D directement lorsqu'elle est disponible — étant entendu qu'une bonne association temporelle (r de ,77 à ,81 selon le référentiel) ne garantit pas une précision angulaire absolue, celle-ci restant limitée (RMSE de l'ordre de 30° à 37°) même dans les référentiels les plus favorables. Son usage pour des questions de recherche centrées sur la kinématique précise du geste (Kendon, 2004 ; Trujillo &amp; Holler, 2021) reste donc à valider plus directement, y compris dans les plans où l'association temporelle est bonne, et plus encore dans le plan orthogonal à cet axe, où l'accord observé ici demeure faible.</w:t>
       </w:r>
     </w:p>
     <w:p>
@@ -4605,7 +4605,7 @@
         <w:rPr>
           <w:rFonts w:ascii="Times New Roman" w:hAnsi="Times New Roman" w:cs="Times New Roman"/>
         </w:rPr>
-        <w:t xml:space="preserve">Cette étude fournit la première évaluation de la validité concomitante de MediaPipe Pose face à une référence Vicon dans un contexte de conversation dyadique spontanée, à deux niveaux de description biomécanique. Les résultats montrent que cette validité n'est pas monolithique : elle est forte pour les métriques globales et intégratives du mouvement — en particulier la quantité de mouvement globale du poignet et de la tête —, et se maintient pour un descripteur cinématique local comme l'angle articulaire du coude dans la plupart des référentiels de comparaison, mais s'affaiblit nettement dans le plan de projection le plus éloigné de l'axe de vue effectif de la caméra. MediaPipe constitue donc un outil valide et accessible pour l'étude écologique de la dynamique globale du mouvement en interaction spontanée, ainsi que pour une analyse articulaire plus fine sous réserve de choisir un plan de comparaison adapté à la géométrie de la prise de vue ; sa pertinence pour l'étude de la coordination interpersonnelle en tant que telle reste à établir par une analyse conjointe des deux interlocuteurs, non menée ici. Le choix d'un système d'estimation de pose sans marqueurs pour la recherche sur l'interaction sociale devrait donc être guidé non par sa simple disponibilité, mais par le niveau de granularité que la question de recherche exige réellement.</w:t>
+        <w:t xml:space="preserve">Cette étude fournit la première évaluation de la validité concomitante de MediaPipe Pose face à une référence Vicon dans un contexte de conversation dyadique spontanée, à deux niveaux de description biomécanique. Les résultats montrent que cette validité n'est pas monolithique : elle est forte pour les métriques globales et intégratives du mouvement — en particulier la quantité de mouvement globale du poignet et de la tête —, et la dynamique temporelle de l'angle articulaire du coude est également bien restituée dans la plupart des référentiels de comparaison, sans que l'exactitude angulaire absolue ne soit du même ordre (RMSE de 30° à 37° même dans les meilleurs référentiels) ; pour l'un comme pour l'autre aspect, l'accord s'affaiblit nettement dans le plan de projection le plus éloigné de l'axe de vue effectif de la caméra. MediaPipe constitue donc un outil valide et accessible pour l'étude écologique de la dynamique globale du mouvement en interaction spontanée, ainsi que pour le suivi de la dynamique temporelle d'un geste articulaire sous réserve de choisir un plan de comparaison adapté à la géométrie de la prise de vue — mais pas, en l'état, pour une mesure précise de l'angle absolu ; sa pertinence pour l'étude de la coordination interpersonnelle en tant que telle reste à établir par une analyse conjointe des deux interlocuteurs, non menée ici. Le choix d'un système d'estimation de pose sans marqueurs pour la recherche sur l'interaction sociale devrait donc être guidé non par sa simple disponibilité, mais par le niveau de granularité — et le type d'exactitude, relative ou absolue — que la question de recherche exige réellement.</w:t>
       </w:r>
     </w:p>
     <w:p>

</xml_diff>